<commit_message>
feat(ui): overhaul application layout scaling, responsive dashboard, and deliverables generation
</commit_message>
<xml_diff>
--- a/reports/generated/test_report.docx
+++ b/reports/generated/test_report.docx
@@ -202,7 +202,7 @@
                 <w:color w:val="1D1D1F"/>
                 <w:sz w:val="20"/>
               </w:rPr>
-              <w:t>2026-10-08 15:46:16</w:t>
+              <w:t>2026-10-09 10:34:58</w:t>
             </w:r>
           </w:p>
         </w:tc>
@@ -2066,7 +2066,7 @@
         <w:br/>
         <w:t>Probe Timeout: 0.35s | Concurrency: 250 workers</w:t>
         <w:br/>
-        <w:t>Timestamp: Started at 2026-10-08T15:46:16.817628 | Concluded at N/A</w:t>
+        <w:t>Timestamp: Started at 2026-10-09T10:34:58.118216 | Concluded at N/A</w:t>
         <w:br/>
       </w:r>
     </w:p>

</xml_diff>